<commit_message>
fix: corregir portada institucional en Documentos/ (carnés, nombres, TEC)
</commit_message>
<xml_diff>
--- a/Documentos/Documentacion_Tecnica.docx
+++ b/Documentos/Documentacion_Tecnica.docx
@@ -4,111 +4,253 @@
   <w:body>
     <w:p>
       <w:pPr>
-        <w:spacing w:before="1800"/>
+        <w:spacing w:after="600" w:before="600"/>
+        <w:jc w:val="center"/>
+      </w:pPr>
+      <w:r>
+        <w:drawing>
+          <wp:inline distT="0" distB="0" distL="0" distR="0">
+            <wp:extent cx="3619500" cy="914400"/>
+            <wp:effectExtent t="0" r="0" b="0" l="0"/>
+            <wp:docPr id="1" name="" descr="" title=""/>
+            <wp:cNvGraphicFramePr>
+              <a:graphicFrameLocks xmlns:a="http://schemas.openxmlformats.org/drawingml/2006/main" noChangeAspect="1"/>
+            </wp:cNvGraphicFramePr>
+            <a:graphic xmlns:a="http://schemas.openxmlformats.org/drawingml/2006/main">
+              <a:graphicData uri="http://schemas.openxmlformats.org/drawingml/2006/picture">
+                <pic:pic xmlns:pic="http://schemas.openxmlformats.org/drawingml/2006/picture">
+                  <pic:nvPicPr>
+                    <pic:cNvPr id="0" name="" descr=""/>
+                    <pic:cNvPicPr>
+                      <a:picLocks noChangeAspect="1" noChangeArrowheads="1"/>
+                    </pic:cNvPicPr>
+                  </pic:nvPicPr>
+                  <pic:blipFill>
+                    <a:blip r:embed="rId7" cstate="none"/>
+                    <a:srcRect/>
+                    <a:stretch>
+                      <a:fillRect/>
+                    </a:stretch>
+                  </pic:blipFill>
+                  <pic:spPr bwMode="auto">
+                    <a:xfrm>
+                      <a:off x="0" y="0"/>
+                      <a:ext cx="3619500" cy="914400"/>
+                    </a:xfrm>
+                    <a:prstGeom prst="rect">
+                      <a:avLst/>
+                    </a:prstGeom>
+                  </pic:spPr>
+                </pic:pic>
+              </a:graphicData>
+            </a:graphic>
+          </wp:inline>
+        </w:drawing>
+      </w:r>
+    </w:p>
+    <w:p>
+      <w:pPr>
+        <w:spacing w:after="300"/>
+      </w:pPr>
+    </w:p>
+    <w:p>
+      <w:pPr>
+        <w:spacing w:after="300"/>
+      </w:pPr>
+    </w:p>
+    <w:p>
+      <w:pPr>
+        <w:spacing w:after="60"/>
+        <w:jc w:val="center"/>
+      </w:pPr>
+      <w:r>
+        <w:rPr>
+          <w:b w:val="false"/>
+          <w:bCs w:val="false"/>
+          <w:sz w:val="28"/>
+          <w:szCs w:val="28"/>
+        </w:rPr>
+        <w:t xml:space="preserve">INSTITUTO TECNOLÓGICO DE COSTA RICA</w:t>
+      </w:r>
+    </w:p>
+    <w:p>
+      <w:pPr>
+        <w:spacing w:after="60"/>
+        <w:jc w:val="center"/>
+      </w:pPr>
+      <w:r>
+        <w:rPr>
+          <w:b w:val="false"/>
+          <w:bCs w:val="false"/>
+          <w:sz w:val="28"/>
+          <w:szCs w:val="28"/>
+        </w:rPr>
+        <w:t xml:space="preserve">UNIDAD DE COMPUTACIÓN</w:t>
+      </w:r>
+    </w:p>
+    <w:p>
+      <w:pPr>
+        <w:spacing w:after="60"/>
+        <w:jc w:val="center"/>
+      </w:pPr>
+      <w:r>
+        <w:rPr>
+          <w:b w:val="false"/>
+          <w:bCs w:val="false"/>
+          <w:sz w:val="28"/>
+          <w:szCs w:val="28"/>
+        </w:rPr>
+        <w:t xml:space="preserve">Campus Tecnológico Local San Carlos</w:t>
+      </w:r>
+    </w:p>
+    <w:p>
+      <w:pPr>
+        <w:spacing w:after="200"/>
+        <w:jc w:val="center"/>
+      </w:pPr>
+      <w:r>
+        <w:rPr>
+          <w:b w:val="false"/>
+          <w:bCs w:val="false"/>
+          <w:sz w:val="28"/>
+          <w:szCs w:val="28"/>
+        </w:rPr>
+        <w:t xml:space="preserve">IC-1802 Introducción a la Programación, G53</w:t>
+      </w:r>
+    </w:p>
+    <w:p>
+      <w:pPr>
+        <w:spacing w:after="100"/>
         <w:jc w:val="center"/>
       </w:pPr>
       <w:r>
         <w:rPr>
           <w:b/>
           <w:bCs/>
-          <w:color w:val="1F3864"/>
-          <w:sz w:val="48"/>
-          <w:szCs w:val="48"/>
-        </w:rPr>
-        <w:t xml:space="preserve">DOCUMENTACIÓN TÉCNICA</w:t>
-      </w:r>
-    </w:p>
-    <w:p>
-      <w:pPr>
-        <w:spacing w:before="160"/>
+          <w:sz w:val="28"/>
+          <w:szCs w:val="28"/>
+        </w:rPr>
+        <w:t xml:space="preserve">Proyecto II, Defensa y Asalto de Base</w:t>
+      </w:r>
+    </w:p>
+    <w:p>
+      <w:pPr>
+        <w:spacing w:after="400"/>
         <w:jc w:val="center"/>
       </w:pPr>
       <w:r>
         <w:rPr>
-          <w:color w:val="2E75B6"/>
+          <w:b/>
+          <w:bCs/>
+          <w:sz w:val="28"/>
+          <w:szCs w:val="28"/>
+        </w:rPr>
+        <w:t xml:space="preserve">Documentación Técnica</w:t>
+      </w:r>
+    </w:p>
+    <w:p>
+      <w:pPr>
+        <w:spacing w:after="60"/>
+        <w:jc w:val="center"/>
+      </w:pPr>
+      <w:r>
+        <w:rPr>
+          <w:b/>
+          <w:bCs/>
+          <w:sz w:val="28"/>
+          <w:szCs w:val="28"/>
+        </w:rPr>
+        <w:t xml:space="preserve">Estudiantes:</w:t>
+      </w:r>
+    </w:p>
+    <w:p>
+      <w:pPr>
+        <w:spacing w:after="40"/>
+        <w:jc w:val="center"/>
+      </w:pPr>
+      <w:r>
+        <w:rPr>
+          <w:b/>
+          <w:bCs/>
+          <w:sz w:val="28"/>
+          <w:szCs w:val="28"/>
+        </w:rPr>
+        <w:t xml:space="preserve">David De Jesús Zamora Villalobos, carné 2018107511</w:t>
+      </w:r>
+    </w:p>
+    <w:p>
+      <w:pPr>
+        <w:spacing w:after="400"/>
+        <w:jc w:val="center"/>
+      </w:pPr>
+      <w:r>
+        <w:rPr>
+          <w:b/>
+          <w:bCs/>
+          <w:sz w:val="28"/>
+          <w:szCs w:val="28"/>
+        </w:rPr>
+        <w:t xml:space="preserve">Josué David Solano Monge, carné 2026083357</w:t>
+      </w:r>
+    </w:p>
+    <w:p>
+      <w:pPr>
+        <w:spacing w:after="60"/>
+        <w:jc w:val="center"/>
+      </w:pPr>
+      <w:r>
+        <w:rPr>
+          <w:b/>
+          <w:bCs/>
           <w:sz w:val="32"/>
           <w:szCs w:val="32"/>
         </w:rPr>
-        <w:t xml:space="preserve">Proyecto: Defensa y Asalto de Base</w:t>
-      </w:r>
-    </w:p>
-    <w:p>
-      <w:pPr>
-        <w:spacing w:before="600"/>
+        <w:t xml:space="preserve">Profesores:</w:t>
+      </w:r>
+    </w:p>
+    <w:p>
+      <w:pPr>
+        <w:spacing w:after="40"/>
         <w:jc w:val="center"/>
       </w:pPr>
       <w:r>
         <w:rPr>
-          <w:sz w:val="22"/>
-          <w:szCs w:val="22"/>
-        </w:rPr>
-        <w:t xml:space="preserve">Curso: Introducción a la Programación — Modalidad Live Learning</w:t>
-      </w:r>
-    </w:p>
-    <w:p>
-      <w:pPr>
+          <w:b w:val="false"/>
+          <w:bCs w:val="false"/>
+          <w:sz w:val="28"/>
+          <w:szCs w:val="28"/>
+        </w:rPr>
+        <w:t xml:space="preserve">Jeff Schmidt Peralta</w:t>
+      </w:r>
+    </w:p>
+    <w:p>
+      <w:pPr>
+        <w:spacing w:after="400"/>
         <w:jc w:val="center"/>
       </w:pPr>
       <w:r>
         <w:rPr>
-          <w:sz w:val="22"/>
-          <w:szCs w:val="22"/>
-        </w:rPr>
-        <w:t xml:space="preserve">Instituto Tecnológico de Costa Rica</w:t>
-      </w:r>
-    </w:p>
-    <w:p>
-      <w:pPr>
-        <w:spacing w:before="400"/>
+          <w:b w:val="false"/>
+          <w:bCs w:val="false"/>
+          <w:sz w:val="28"/>
+          <w:szCs w:val="28"/>
+        </w:rPr>
+        <w:t xml:space="preserve">Diego Andrés Mora Rojas</w:t>
+      </w:r>
+    </w:p>
+    <w:p>
+      <w:pPr>
+        <w:spacing w:after="0"/>
         <w:jc w:val="center"/>
       </w:pPr>
       <w:r>
         <w:rPr>
-          <w:b/>
-          <w:bCs/>
-          <w:sz w:val="24"/>
-          <w:szCs w:val="24"/>
-        </w:rPr>
-        <w:t xml:space="preserve">Integrantes:</w:t>
-      </w:r>
-    </w:p>
-    <w:p>
-      <w:pPr>
-        <w:jc w:val="center"/>
-      </w:pPr>
-      <w:r>
-        <w:rPr>
-          <w:sz w:val="22"/>
-          <w:szCs w:val="22"/>
-        </w:rPr>
-        <w:t xml:space="preserve">David Zamora Villalobos</w:t>
-      </w:r>
-    </w:p>
-    <w:p>
-      <w:pPr>
-        <w:jc w:val="center"/>
-      </w:pPr>
-      <w:r>
-        <w:rPr>
-          <w:sz w:val="22"/>
-          <w:szCs w:val="22"/>
-        </w:rPr>
-        <w:t xml:space="preserve">Josué Solano Monje</w:t>
-      </w:r>
-    </w:p>
-    <w:p>
-      <w:pPr>
-        <w:spacing w:before="200"/>
-        <w:jc w:val="center"/>
-      </w:pPr>
-      <w:r>
-        <w:rPr>
-          <w:i/>
-          <w:iCs/>
-          <w:sz w:val="22"/>
-          <w:szCs w:val="22"/>
-        </w:rPr>
-        <w:t xml:space="preserve">Junio 2026</w:t>
+          <w:b w:val="false"/>
+          <w:bCs w:val="false"/>
+          <w:sz w:val="28"/>
+          <w:szCs w:val="28"/>
+        </w:rPr>
+        <w:t xml:space="preserve">21 de junio del 2026</w:t>
       </w:r>
     </w:p>
     <w:p>
@@ -4037,7 +4179,7 @@
           <w:sz w:val="26"/>
           <w:szCs w:val="26"/>
         </w:rPr>
-        <w:t xml:space="preserve">David Zamora Villalobos</w:t>
+        <w:t xml:space="preserve">David De Jesús Zamora Villalobos</w:t>
       </w:r>
     </w:p>
     <w:p>
@@ -4064,7 +4206,7 @@
           <w:sz w:val="26"/>
           <w:szCs w:val="26"/>
         </w:rPr>
-        <w:t xml:space="preserve">Josué Solano Monje</w:t>
+        <w:t xml:space="preserve">Josué Solano Monge</w:t>
       </w:r>
     </w:p>
     <w:p>

</xml_diff>